<commit_message>
Update downloadable résumé: merge El Paso Labs roles into promotion timeline
Fixes the overlapping AI Agent Engineer / Software Engineer dates that read
as padding — now one El Paso Labs entry (AI Agent Engineer, promoted from
Software Engineer · Oct 2023 – Present), matching the site's Experience section.

Co-Authored-By: Claude Opus 4.8 (1M context) <noreply@anthropic.com>
</commit_message>
<xml_diff>
--- a/public/Bryan_R_Figueroa_Resume.docx
+++ b/public/Bryan_R_Figueroa_Resume.docx
@@ -202,7 +202,7 @@
           <w:szCs w:val="21"/>
           <w:rtl w:val="0"/>
         </w:rPr>
-        <w:t xml:space="preserve">  —  AI Agent Engineer</w:t>
+        <w:t xml:space="preserve">  —  AI Agent Engineer  (promoted from Software Engineer)</w:t>
       </w:r>
       <w:r>
         <w:rPr>
@@ -214,7 +214,7 @@
           <w:szCs w:val="19"/>
           <w:rtl w:val="0"/>
         </w:rPr>
-        <w:t xml:space="preserve">Mar 2024 – Present</w:t>
+        <w:t>Oct 2023 – Present</w:t>
       </w:r>
       <w:r>
         <w:rPr>
@@ -550,54 +550,6 @@
           <w:rtl w:val="0"/>
         </w:rPr>
         <w:t xml:space="preserve"> with custom evaluators for expert routing, response completeness, scope handling, and Zendesk-action correctness.</w:t>
-      </w:r>
-      <w:r>
-        <w:rPr>
-          <w:rtl w:val="0"/>
-        </w:rPr>
-      </w:r>
-    </w:p>
-    <w:p>
-      <w:pPr>
-        <w:tabs>
-          <w:tab w:val="right" w:leader="none" w:pos="10512"/>
-        </w:tabs>
-        <w:spacing w:after="20" w:before="90" w:lineRule="auto"/>
-        <w:rPr/>
-      </w:pPr>
-      <w:r>
-        <w:rPr>
-          <w:rFonts w:ascii="Arial" w:cs="Arial" w:eastAsia="Arial" w:hAnsi="Arial"/>
-          <w:b w:val="1"/>
-          <w:bCs w:val="1"/>
-          <w:color w:val="1a1a1a"/>
-          <w:sz w:val="21"/>
-          <w:szCs w:val="21"/>
-          <w:rtl w:val="0"/>
-        </w:rPr>
-        <w:t xml:space="preserve">El Paso Labs</w:t>
-      </w:r>
-      <w:r>
-        <w:rPr>
-          <w:rFonts w:ascii="Arial" w:cs="Arial" w:eastAsia="Arial" w:hAnsi="Arial"/>
-          <w:color w:val="1a1a1a"/>
-          <w:sz w:val="21"/>
-          <w:szCs w:val="21"/>
-          <w:rtl w:val="0"/>
-        </w:rPr>
-        <w:t xml:space="preserve">  —  Software Engineer</w:t>
-      </w:r>
-      <w:r>
-        <w:rPr>
-          <w:rFonts w:ascii="Arial" w:cs="Arial" w:eastAsia="Arial" w:hAnsi="Arial"/>
-          <w:i w:val="1"/>
-          <w:iCs w:val="1"/>
-          <w:color w:val="595959"/>
-          <w:sz w:val="19"/>
-          <w:szCs w:val="19"/>
-          <w:rtl w:val="0"/>
-        </w:rPr>
-        <w:t xml:space="preserve">Oct 2023 – Jun 2025</w:t>
       </w:r>
       <w:r>
         <w:rPr>

</xml_diff>

<commit_message>
Trim education to UTEP only; drop GPAs and A.A.
Update downloadable résumé to latest version.

Co-Authored-By: Claude Opus 4.8 (1M context) <noreply@anthropic.com>
</commit_message>
<xml_diff>
--- a/public/Bryan_R_Figueroa_Resume.docx
+++ b/public/Bryan_R_Figueroa_Resume.docx
@@ -214,7 +214,7 @@
           <w:szCs w:val="19"/>
           <w:rtl w:val="0"/>
         </w:rPr>
-        <w:t>Oct 2023 – Present</w:t>
+        <w:t xml:space="preserve">Oct 2023 – Present</w:t>
       </w:r>
       <w:r>
         <w:rPr>
@@ -717,21 +717,21 @@
       <w:r>
         <w:rPr>
           <w:rFonts w:ascii="Arial" w:cs="Arial" w:eastAsia="Arial" w:hAnsi="Arial"/>
-          <w:b/>
-          <w:bCs w:val="1"/>
-          <w:i w:val="0"/>
-          <w:iCs w:val="0"/>
-          <w:smallCaps w:val="0"/>
-          <w:strike w:val="0"/>
-          <w:color w:val="1a1a1a"/>
-          <w:sz w:val="19"/>
-          <w:szCs w:val="19"/>
-          <w:u w:val="none"/>
-          <w:shd w:fill="auto" w:val="clear"/>
-          <w:vertAlign w:val="baseline"/>
-          <w:rtl w:val="0"/>
-        </w:rPr>
-        <w:t>RAG Dashboard</w:t>
+          <w:b w:val="1"/>
+          <w:bCs w:val="1"/>
+          <w:i w:val="0"/>
+          <w:iCs w:val="0"/>
+          <w:smallCaps w:val="0"/>
+          <w:strike w:val="0"/>
+          <w:color w:val="1a1a1a"/>
+          <w:sz w:val="19"/>
+          <w:szCs w:val="19"/>
+          <w:u w:val="none"/>
+          <w:shd w:fill="auto" w:val="clear"/>
+          <w:vertAlign w:val="baseline"/>
+          <w:rtl w:val="0"/>
+        </w:rPr>
+        <w:t xml:space="preserve">RAG Dashboard</w:t>
       </w:r>
       <w:r>
         <w:rPr>
@@ -751,6 +751,11 @@
           <w:rtl w:val="0"/>
         </w:rPr>
         <w:t xml:space="preserve"> — led the full stack: an Angular 21 frontend over a FastAPI + Azure AI Search backend, with a dual-strategy (BFS + Playwright) crawler the team extended from an earlier KB crawler I built, query-logging analytics, JWT/MSAL auth, and a one-image-any-environment deploy on Azure Container Apps.</w:t>
+      </w:r>
+      <w:r>
+        <w:rPr>
+          <w:rtl w:val="0"/>
+        </w:rPr>
       </w:r>
     </w:p>
     <w:p>
@@ -1399,66 +1404,6 @@
           <w:rtl w:val="0"/>
         </w:rPr>
         <w:t xml:space="preserve"> — University of Texas at El Paso (UTEP)</w:t>
-      </w:r>
-      <w:r>
-        <w:rPr>
-          <w:rFonts w:ascii="Arial" w:cs="Arial" w:eastAsia="Arial" w:hAnsi="Arial"/>
-          <w:i w:val="1"/>
-          <w:iCs w:val="1"/>
-          <w:color w:val="595959"/>
-          <w:sz w:val="19"/>
-          <w:szCs w:val="19"/>
-          <w:rtl w:val="0"/>
-        </w:rPr>
-        <w:t xml:space="preserve">GPA 3.73</w:t>
-      </w:r>
-      <w:r>
-        <w:rPr>
-          <w:rtl w:val="0"/>
-        </w:rPr>
-      </w:r>
-    </w:p>
-    <w:p>
-      <w:pPr>
-        <w:tabs>
-          <w:tab w:val="right" w:leader="none" w:pos="10512"/>
-        </w:tabs>
-        <w:spacing w:after="20" w:lineRule="auto"/>
-        <w:rPr/>
-      </w:pPr>
-      <w:r>
-        <w:rPr>
-          <w:rFonts w:ascii="Arial" w:cs="Arial" w:eastAsia="Arial" w:hAnsi="Arial"/>
-          <w:b w:val="1"/>
-          <w:bCs w:val="1"/>
-          <w:color w:val="1a1a1a"/>
-          <w:sz w:val="19"/>
-          <w:szCs w:val="19"/>
-          <w:rtl w:val="0"/>
-        </w:rPr>
-        <w:t xml:space="preserve">A.A. Computer Science</w:t>
-      </w:r>
-      <w:r>
-        <w:rPr>
-          <w:rFonts w:ascii="Arial" w:cs="Arial" w:eastAsia="Arial" w:hAnsi="Arial"/>
-          <w:color w:val="1a1a1a"/>
-          <w:sz w:val="19"/>
-          <w:szCs w:val="19"/>
-          <w:rtl w:val="0"/>
-        </w:rPr>
-        <w:t xml:space="preserve"> — El Paso Community College (EPCC)</w:t>
-      </w:r>
-      <w:r>
-        <w:rPr>
-          <w:rFonts w:ascii="Arial" w:cs="Arial" w:eastAsia="Arial" w:hAnsi="Arial"/>
-          <w:i w:val="1"/>
-          <w:iCs w:val="1"/>
-          <w:color w:val="595959"/>
-          <w:sz w:val="19"/>
-          <w:szCs w:val="19"/>
-          <w:rtl w:val="0"/>
-        </w:rPr>
-        <w:t xml:space="preserve">GPA 3.92</w:t>
       </w:r>
       <w:r>
         <w:rPr>
@@ -2204,7 +2149,7 @@
 
 <file path=customXML/item1.xml><?xml version="1.0" encoding="utf-8"?>
 <go:gDocsCustomXmlDataStorage xmlns:go="http://customooxmlschemas.google.com/" xmlns:r="http://schemas.openxmlformats.org/officeDocument/2006/relationships" uri="GoogleDocsCustomDataVersion2">
-  <go:docsCustomData xmlns:go="http://customooxmlschemas.google.com/" roundtripDataSignature="AMtx7miMck4qEk7jhhV6hOvwUxV7qdJjPg==">CgMxLjA4AHIhMWlBck14SkZlN2xrcndlaDFSMDFjUTNHaENvQ2xfZGJE</go:docsCustomData>
+  <go:docsCustomData xmlns:go="http://customooxmlschemas.google.com/" roundtripDataSignature="AMtx7mjm0u2y3JK+iIHS10jULabtw7/W9Q==">CgMxLjA4AHIhMXFUQzdEa3FRMnZia0tQSC0tSVFQaXFPSnIyT09yTm1h</go:docsCustomData>
 </go:gDocsCustomXmlDataStorage>
 </file>
 

</xml_diff>